<commit_message>
updated my recent updates from my work
</commit_message>
<xml_diff>
--- a/Sankula_Koteswara_Rao_ATS_Resume.docx
+++ b/Sankula_Koteswara_Rao_ATS_Resume.docx
@@ -72,7 +72,7 @@
           <w:color w:val="000000"/>
           <w:sz w:val="18"/>
         </w:rPr>
-        <w:t>Software developer and final-year B.Tech Artificial Intelligence and Machine Learning student with hands-on experience building Python, Django, Flask, REST API, React, JavaScript, and Streamlit applications. Completed a 6-month Python Development internship with Flipkart Launchpad and built public projects across employee leave management, ERP portals, AI chatbots, automation tools, and responsive web platforms. Strong fit for entry-level software developer, Python developer, backend developer, frontend developer, and full-stack developer roles.</w:t>
+        <w:t>Software developer and final-year B.Tech Artificial Intelligence and Machine Learning student with hands-on experience building Python, Django, Flask, REST API, React, TypeScript, Java, Spring Boot, Express.js, MongoDB, and Streamlit applications. Completed a 6-month Python Development internship with Flipkart Launchpad and built public projects across employee leave management, ERP portals, secure asset management, AI chatbots, automation tools, and responsive web platforms. Strong fit for entry-level software developer, Python developer, backend developer, frontend developer, and full-stack developer roles.</w:t>
       </w:r>
     </w:p>
     <w:p>
@@ -105,7 +105,7 @@
           <w:color w:val="000000"/>
           <w:sz w:val="18"/>
         </w:rPr>
-        <w:t>Languages: Python, JavaScript, TypeScript, HTML5, CSS3</w:t>
+        <w:t>Languages: Python, JavaScript, TypeScript, Java, HTML5, CSS3</w:t>
       </w:r>
     </w:p>
     <w:p>
@@ -121,7 +121,7 @@
           <w:color w:val="000000"/>
           <w:sz w:val="18"/>
         </w:rPr>
-        <w:t>Backend: Django, Flask, REST APIs, authentication, API integration, server-side application logic</w:t>
+        <w:t>Backend: Django, Flask, REST APIs, Spring Boot, Express.js, Node.js, JWT authentication, API integration</w:t>
       </w:r>
     </w:p>
     <w:p>
@@ -137,7 +137,7 @@
           <w:color w:val="000000"/>
           <w:sz w:val="18"/>
         </w:rPr>
-        <w:t>Frontend: React.js, responsive UI, Bootstrap, Tailwind CSS, DOM manipulation, accessibility basics</w:t>
+        <w:t>Frontend: React.js, Vite, Tailwind CSS, responsive UI, Bootstrap, DOM manipulation</w:t>
       </w:r>
     </w:p>
     <w:p>
@@ -153,7 +153,7 @@
           <w:color w:val="000000"/>
           <w:sz w:val="18"/>
         </w:rPr>
-        <w:t>Databases and Tools: SQLite, Git, GitHub, Vercel, Render, Streamlit, VS Code</w:t>
+        <w:t>Databases and Tools: MongoDB, MongoDB Atlas, Mongoose, SQLite, Git, GitHub, Docker, Vercel, Render, Streamlit</w:t>
       </w:r>
     </w:p>
     <w:p>
@@ -174,22 +174,6 @@
     </w:p>
     <w:p>
       <w:pPr>
-        <w:pStyle w:val="ListBullet"/>
-        <w:spacing w:after="28"/>
-        <w:ind w:left="259" w:hanging="259"/>
-      </w:pPr>
-      <w:r>
-        <w:rPr>
-          <w:rFonts w:ascii="Arial" w:hAnsi="Arial"/>
-          <w:b w:val="0"/>
-          <w:color w:val="000000"/>
-          <w:sz w:val="18"/>
-        </w:rPr>
-        <w:t>Software Practices: debugging, clean code, version control, deployment, documentation, teamwork</w:t>
-      </w:r>
-    </w:p>
-    <w:p>
-      <w:pPr>
         <w:pStyle w:val="Heading1"/>
         <w:pBdr>
           <w:bottom w:val="single" w:sz="6" w:space="1" w:color="BFBFBF"/>
@@ -203,77 +187,6 @@
           <w:sz w:val="21"/>
         </w:rPr>
         <w:t>PROFESSIONAL EXPERIENCE</w:t>
-      </w:r>
-    </w:p>
-    <w:p>
-      <w:pPr>
-        <w:spacing w:after="20"/>
-      </w:pPr>
-      <w:r>
-        <w:rPr>
-          <w:rFonts w:ascii="Arial" w:hAnsi="Arial"/>
-          <w:b/>
-          <w:color w:val="000000"/>
-          <w:sz w:val="19"/>
-        </w:rPr>
-        <w:t>Coordinator</w:t>
-      </w:r>
-      <w:r>
-        <w:rPr>
-          <w:rFonts w:ascii="Arial" w:hAnsi="Arial"/>
-          <w:b w:val="0"/>
-          <w:color w:val="000000"/>
-          <w:sz w:val="18"/>
-        </w:rPr>
-        <w:t xml:space="preserve"> | Techno Future India | May 2026 - Present | Guntur, Andhra Pradesh</w:t>
-      </w:r>
-    </w:p>
-    <w:p>
-      <w:pPr>
-        <w:pStyle w:val="ListBullet"/>
-        <w:spacing w:after="28"/>
-        <w:ind w:left="259" w:hanging="259"/>
-      </w:pPr>
-      <w:r>
-        <w:rPr>
-          <w:rFonts w:ascii="Arial" w:hAnsi="Arial"/>
-          <w:b w:val="0"/>
-          <w:color w:val="000000"/>
-          <w:sz w:val="18"/>
-        </w:rPr>
-        <w:t>Mentor internship cohorts on MERN Stack fundamentals, software development workflow, debugging, and project execution.</w:t>
-      </w:r>
-    </w:p>
-    <w:p>
-      <w:pPr>
-        <w:pStyle w:val="ListBullet"/>
-        <w:spacing w:after="28"/>
-        <w:ind w:left="259" w:hanging="259"/>
-      </w:pPr>
-      <w:r>
-        <w:rPr>
-          <w:rFonts w:ascii="Arial" w:hAnsi="Arial"/>
-          <w:b w:val="0"/>
-          <w:color w:val="000000"/>
-          <w:sz w:val="18"/>
-        </w:rPr>
-        <w:t>Design structured learning sessions covering frontend development, backend concepts, teamwork, and practical implementation.</w:t>
-      </w:r>
-    </w:p>
-    <w:p>
-      <w:pPr>
-        <w:pStyle w:val="ListBullet"/>
-        <w:spacing w:after="28"/>
-        <w:ind w:left="259" w:hanging="259"/>
-      </w:pPr>
-      <w:r>
-        <w:rPr>
-          <w:rFonts w:ascii="Arial" w:hAnsi="Arial"/>
-          <w:b w:val="0"/>
-          <w:color w:val="000000"/>
-          <w:sz w:val="18"/>
-        </w:rPr>
-        <w:t>Guide students through real-world development practices to improve project completion quality and technical confidence.</w:t>
       </w:r>
     </w:p>
     <w:p>
@@ -444,7 +357,7 @@
           <w:color w:val="000000"/>
           <w:sz w:val="19"/>
         </w:rPr>
-        <w:t>College ERP Portal</w:t>
+        <w:t>CIET ERP - College Website</w:t>
       </w:r>
       <w:r>
         <w:rPr>
@@ -453,7 +366,7 @@
           <w:color w:val="000000"/>
           <w:sz w:val="18"/>
         </w:rPr>
-        <w:t xml:space="preserve"> | Django, Python, HTML, CSS, JavaScript</w:t>
+        <w:t xml:space="preserve"> | React, TypeScript, Vite, Java, Spring Boot, Spring Security, JWT, MongoDB Atlas, Docker</w:t>
       </w:r>
     </w:p>
     <w:p>
@@ -467,7 +380,7 @@
           <w:color w:val="404040"/>
           <w:sz w:val="16"/>
         </w:rPr>
-        <w:t>github.com/rkotesh/ciet_erp</w:t>
+        <w:t>github.com/rkotesh/college_website | college-website-omega-flax.vercel.app</w:t>
       </w:r>
     </w:p>
     <w:p>
@@ -483,7 +396,7 @@
           <w:color w:val="000000"/>
           <w:sz w:val="18"/>
         </w:rPr>
-        <w:t>Developed an academic ERP portal for student attendance, records, assignments, and administrative workflows.</w:t>
+        <w:t>Built a role-based college ERP platform for Students, Faculty, Mentors, HODs, and Admins with dedicated dashboards and protected routing.</w:t>
       </w:r>
     </w:p>
     <w:p>
@@ -499,7 +412,7 @@
           <w:color w:val="000000"/>
           <w:sz w:val="18"/>
         </w:rPr>
-        <w:t>Created structured dashboard screens and data-management flows for college operations.</w:t>
+        <w:t>Implemented backend APIs with Spring Boot, JWT authentication, MongoDB repositories, OTP verification, announcements, mentorship tracking, portfolio modules, and accreditation tools.</w:t>
       </w:r>
     </w:p>
     <w:p>
@@ -513,7 +426,7 @@
           <w:color w:val="000000"/>
           <w:sz w:val="19"/>
         </w:rPr>
-        <w:t>Rolla AI Digital Agency Platform</w:t>
+        <w:t>Secure Vault Asset Management SPA</w:t>
       </w:r>
       <w:r>
         <w:rPr>
@@ -522,7 +435,7 @@
           <w:color w:val="000000"/>
           <w:sz w:val="18"/>
         </w:rPr>
-        <w:t xml:space="preserve"> | MERN Stack, Django, Next.js, Tailwind CSS</w:t>
+        <w:t xml:space="preserve"> | React, Vite, Tailwind CSS, Express.js, MongoDB, Mongoose, JWT, AWS S3, Docker</w:t>
       </w:r>
     </w:p>
     <w:p>
@@ -536,7 +449,7 @@
           <w:color w:val="404040"/>
           <w:sz w:val="16"/>
         </w:rPr>
-        <w:t>github.com/rkotesh/rolla-ai | rolla-ai.vercel.app</w:t>
+        <w:t>github.com/rkotesh/asset-management-spa</w:t>
       </w:r>
     </w:p>
     <w:p>
@@ -552,7 +465,7 @@
           <w:color w:val="000000"/>
           <w:sz w:val="18"/>
         </w:rPr>
-        <w:t>Built a responsive digital agency and SaaS development platform with modern UI, SEO structure, and deployment-ready pages.</w:t>
+        <w:t>Built a secure asset browser with role-based access, asset upload, search, category filters, preview/download flows, and admin analytics dashboards.</w:t>
       </w:r>
     </w:p>
     <w:p>
@@ -568,129 +481,7 @@
           <w:color w:val="000000"/>
           <w:sz w:val="18"/>
         </w:rPr>
-        <w:t>Designed reusable web sections for service positioning, client acquisition, and software product presentation.</w:t>
-      </w:r>
-    </w:p>
-    <w:p>
-      <w:pPr>
-        <w:spacing w:after="0"/>
-      </w:pPr>
-      <w:r>
-        <w:rPr>
-          <w:rFonts w:ascii="Arial" w:hAnsi="Arial"/>
-          <w:b/>
-          <w:color w:val="000000"/>
-          <w:sz w:val="19"/>
-        </w:rPr>
-        <w:t>Hospital Chatbot</w:t>
-      </w:r>
-      <w:r>
-        <w:rPr>
-          <w:rFonts w:ascii="Arial" w:hAnsi="Arial"/>
-          <w:b w:val="0"/>
-          <w:color w:val="000000"/>
-          <w:sz w:val="18"/>
-        </w:rPr>
-        <w:t xml:space="preserve"> | Python, AI, Streamlit, Chatbot</w:t>
-      </w:r>
-    </w:p>
-    <w:p>
-      <w:pPr>
-        <w:spacing w:after="0"/>
-      </w:pPr>
-      <w:r>
-        <w:rPr>
-          <w:rFonts w:ascii="Arial" w:hAnsi="Arial"/>
-          <w:b w:val="0"/>
-          <w:color w:val="404040"/>
-          <w:sz w:val="16"/>
-        </w:rPr>
-        <w:t>github.com/rkotesh/hospital_chatbot | hospitalchatbot04.streamlit.app</w:t>
-      </w:r>
-    </w:p>
-    <w:p>
-      <w:pPr>
-        <w:pStyle w:val="ListBullet"/>
-        <w:spacing w:after="28"/>
-        <w:ind w:left="259" w:hanging="259"/>
-      </w:pPr>
-      <w:r>
-        <w:rPr>
-          <w:rFonts w:ascii="Arial" w:hAnsi="Arial"/>
-          <w:b w:val="0"/>
-          <w:color w:val="000000"/>
-          <w:sz w:val="18"/>
-        </w:rPr>
-        <w:t>Created an AI chatbot prototype to answer patient queries and support appointment-related interactions.</w:t>
-      </w:r>
-    </w:p>
-    <w:p>
-      <w:pPr>
-        <w:pStyle w:val="ListBullet"/>
-        <w:spacing w:after="28"/>
-        <w:ind w:left="259" w:hanging="259"/>
-      </w:pPr>
-      <w:r>
-        <w:rPr>
-          <w:rFonts w:ascii="Arial" w:hAnsi="Arial"/>
-          <w:b w:val="0"/>
-          <w:color w:val="000000"/>
-          <w:sz w:val="18"/>
-        </w:rPr>
-        <w:t>Built a Streamlit interface for fast browser-based use and live demonstration.</w:t>
-      </w:r>
-    </w:p>
-    <w:p>
-      <w:pPr>
-        <w:spacing w:after="0"/>
-      </w:pPr>
-      <w:r>
-        <w:rPr>
-          <w:rFonts w:ascii="Arial" w:hAnsi="Arial"/>
-          <w:b/>
-          <w:color w:val="000000"/>
-          <w:sz w:val="19"/>
-        </w:rPr>
-        <w:t>QR Code Generator</w:t>
-      </w:r>
-      <w:r>
-        <w:rPr>
-          <w:rFonts w:ascii="Arial" w:hAnsi="Arial"/>
-          <w:b w:val="0"/>
-          <w:color w:val="000000"/>
-          <w:sz w:val="18"/>
-        </w:rPr>
-        <w:t xml:space="preserve"> | Python, Streamlit</w:t>
-      </w:r>
-    </w:p>
-    <w:p>
-      <w:pPr>
-        <w:spacing w:after="0"/>
-      </w:pPr>
-      <w:r>
-        <w:rPr>
-          <w:rFonts w:ascii="Arial" w:hAnsi="Arial"/>
-          <w:b w:val="0"/>
-          <w:color w:val="404040"/>
-          <w:sz w:val="16"/>
-        </w:rPr>
-        <w:t>github.com/rkotesh/QR-Generator | qr-generator04.streamlit.app</w:t>
-      </w:r>
-    </w:p>
-    <w:p>
-      <w:pPr>
-        <w:pStyle w:val="ListBullet"/>
-        <w:spacing w:after="28"/>
-        <w:ind w:left="259" w:hanging="259"/>
-      </w:pPr>
-      <w:r>
-        <w:rPr>
-          <w:rFonts w:ascii="Arial" w:hAnsi="Arial"/>
-          <w:b w:val="0"/>
-          <w:color w:val="000000"/>
-          <w:sz w:val="18"/>
-        </w:rPr>
-        <w:t>Developed a web utility that generates downloadable QR codes for URLs, text, and common input formats.</w:t>
+        <w:t>Implemented Express/Mongoose APIs for JWT auth, file metadata, duplicate detection, signed upload/download URLs, thumbnail optimization, support tickets, workflow automation, and Docker Compose deployment.</w:t>
       </w:r>
     </w:p>
     <w:p>
@@ -781,38 +572,6 @@
     </w:p>
     <w:p>
       <w:pPr>
-        <w:pStyle w:val="ListBullet"/>
-        <w:spacing w:after="28"/>
-        <w:ind w:left="259" w:hanging="259"/>
-      </w:pPr>
-      <w:r>
-        <w:rPr>
-          <w:rFonts w:ascii="Arial" w:hAnsi="Arial"/>
-          <w:b w:val="0"/>
-          <w:color w:val="000000"/>
-          <w:sz w:val="18"/>
-        </w:rPr>
-        <w:t>Intermediate, Sri Saraswathi Jr College, 2021 - 2023 | 90.07%</w:t>
-      </w:r>
-    </w:p>
-    <w:p>
-      <w:pPr>
-        <w:pStyle w:val="ListBullet"/>
-        <w:spacing w:after="28"/>
-        <w:ind w:left="259" w:hanging="259"/>
-      </w:pPr>
-      <w:r>
-        <w:rPr>
-          <w:rFonts w:ascii="Arial" w:hAnsi="Arial"/>
-          <w:b w:val="0"/>
-          <w:color w:val="000000"/>
-          <w:sz w:val="18"/>
-        </w:rPr>
-        <w:t>SSC, Govt Z Z P H School, 2020 - 2021 | 97.00%</w:t>
-      </w:r>
-    </w:p>
-    <w:p>
-      <w:pPr>
         <w:pStyle w:val="Heading1"/>
         <w:pBdr>
           <w:bottom w:val="single" w:sz="6" w:space="1" w:color="BFBFBF"/>
@@ -858,22 +617,6 @@
           <w:sz w:val="18"/>
         </w:rPr>
         <w:t>Freedom With AI Master Class - AI Tools and Prompt Engineering Workflows, Jun 2025</w:t>
-      </w:r>
-    </w:p>
-    <w:p>
-      <w:pPr>
-        <w:pStyle w:val="ListBullet"/>
-        <w:spacing w:after="28"/>
-        <w:ind w:left="259" w:hanging="259"/>
-      </w:pPr>
-      <w:r>
-        <w:rPr>
-          <w:rFonts w:ascii="Arial" w:hAnsi="Arial"/>
-          <w:b w:val="0"/>
-          <w:color w:val="000000"/>
-          <w:sz w:val="18"/>
-        </w:rPr>
-        <w:t>MERN Stack Training - Chalapathi Institute of Engineering and Technology, 2025</w:t>
       </w:r>
     </w:p>
     <w:p>

</xml_diff>